<commit_message>
docs: record Relay private beta deployment
Document the live Vercel readiness and smoke-test results. Keep external access closed until credential mapping, isolation, email-flow, and billing checks pass.
</commit_message>
<xml_diff>
--- a/docs/Relay_Private_Beta_Tester_Access_Runbook.docx
+++ b/docs/Relay_Private_Beta_Tester_Access_Runbook.docx
@@ -23,7 +23,7 @@
         <w:pStyle w:val="Date"/>
       </w:pPr>
       <w:r>
-        <w:t xml:space="preserve">August 24, 2026</w:t>
+        <w:t xml:space="preserve">August 25, 2026</w:t>
       </w:r>
     </w:p>
     <w:bookmarkStart w:id="27" w:name="relay-private-beta-tester-access-runbook"/>
@@ -50,7 +50,7 @@
         <w:br/>
       </w:r>
       <w:r>
-        <w:t xml:space="preserve">Last reviewed: August 24, 2026</w:t>
+        <w:t xml:space="preserve">Last reviewed: August 25, 2026</w:t>
       </w:r>
     </w:p>
     <w:bookmarkStart w:id="11" w:name="current-status"/>
@@ -71,7 +71,7 @@
           <w:b/>
           <w:bCs/>
         </w:rPr>
-        <w:t xml:space="preserve">NOT READY FOR EXTERNAL TESTERS YET.</w:t>
+        <w:t xml:space="preserve">CONTROLLED OWNER TESTING ONLY — NOT READY FOR EXTERNAL TESTERS YET.</w:t>
       </w:r>
     </w:p>
     <w:p>
@@ -79,7 +79,7 @@
         <w:pStyle w:val="BodyText"/>
       </w:pPr>
       <w:r>
-        <w:t xml:space="preserve">The application-side foundation and safeguards exist on</w:t>
+        <w:t xml:space="preserve">The application-side foundation and safeguards are merged into</w:t>
       </w:r>
       <w:r>
         <w:t xml:space="preserve"> </w:t>
@@ -88,10 +88,10 @@
         <w:rPr>
           <w:rStyle w:val="VerbatimChar"/>
         </w:rPr>
-        <w:t xml:space="preserve">feature/private-beta-auth</w:t>
-      </w:r>
-      <w:r>
-        <w:t xml:space="preserve">. The separate zero-cost Vercel project</w:t>
+        <w:t xml:space="preserve">main</w:t>
+      </w:r>
+      <w:r>
+        <w:t xml:space="preserve">. The separate Vercel project</w:t>
       </w:r>
       <w:r>
         <w:t xml:space="preserve"> </w:t>
@@ -106,7 +106,19 @@
         <w:t xml:space="preserve"> </w:t>
       </w:r>
       <w:r>
-        <w:t xml:space="preserve">has been created and its browser-safe production variables are configured, but it has intentionally not been deployed. Automatic Git deployment is deliberately disconnected until Supabase passes readiness.</w:t>
+        <w:t xml:space="preserve">received its first production deployment on August 25, 2026 at</w:t>
+      </w:r>
+      <w:r>
+        <w:t xml:space="preserve"> </w:t>
+      </w:r>
+      <w:r>
+        <w:rPr>
+          <w:rStyle w:val="VerbatimChar"/>
+        </w:rPr>
+        <w:t xml:space="preserve">https://relay-private-beta.vercel.app</w:t>
+      </w:r>
+      <w:r>
+        <w:t xml:space="preserve">. Its browser-safe production variables are configured, no service-role key is present, and automatic Git deployment remains deliberately disconnected while final owner tests are completed.</w:t>
       </w:r>
     </w:p>
     <w:p>
@@ -114,7 +126,7 @@
         <w:pStyle w:val="BodyText"/>
       </w:pPr>
       <w:r>
-        <w:t xml:space="preserve">The configured Supabase backend passed its restored-backup rehearsal and live migration on August 24, 2026. The unrelated Auth user was removed, the two retained accounts are owner-controlled, both migrations applied successfully, and the fail-closed security audit passed. Public signup and anonymous sign-ins are disabled, while email confirmation remains enabled. Do not invite external testers until the remaining URL/template, deployment, and two-account isolation checks pass.</w:t>
+        <w:t xml:space="preserve">The configured Supabase backend passed its restored-backup rehearsal and live migration on August 24, 2026. The unrelated Auth user was removed, the two retained accounts are owner-controlled, both migrations applied successfully, and the fail-closed security audit passed. Public signup and anonymous sign-ins are disabled, email confirmation remains enabled, Relay Auth URLs are configured, and the Relay invitation/recovery templates are saved. The live login redirect and branding smoke test passed on August 25. Do not invite external testers until the two local test-account credentials are mapped to the retained users, the isolation test passes, the invitation/recovery flow is exercised, and billing is confirmed.</w:t>
       </w:r>
     </w:p>
     <w:p>
@@ -384,7 +396,37 @@
         </w:numPr>
       </w:pPr>
       <w:r>
-        <w:t xml:space="preserve">Test two unrelated invited accounts and confirm neither can read, change, delete, subscribe to, download, or guess the other account’s records and files.</w:t>
+        <w:t xml:space="preserve">Test two unrelated invited accounts and confirm neither can read, change, delete, subscribe to, download, or guess the other account’s records and files. Blocked on August 25 because the two</w:t>
+      </w:r>
+      <w:r>
+        <w:t xml:space="preserve"> </w:t>
+      </w:r>
+      <w:r>
+        <w:rPr>
+          <w:rStyle w:val="VerbatimChar"/>
+        </w:rPr>
+        <w:t xml:space="preserve">TEST_USER_*</w:t>
+      </w:r>
+      <w:r>
+        <w:t xml:space="preserve"> </w:t>
+      </w:r>
+      <w:r>
+        <w:t xml:space="preserve">email/password pairs in</w:t>
+      </w:r>
+      <w:r>
+        <w:t xml:space="preserve"> </w:t>
+      </w:r>
+      <w:r>
+        <w:rPr>
+          <w:rStyle w:val="VerbatimChar"/>
+        </w:rPr>
+        <w:t xml:space="preserve">.env.private-beta.local</w:t>
+      </w:r>
+      <w:r>
+        <w:t xml:space="preserve"> </w:t>
+      </w:r>
+      <w:r>
+        <w:t xml:space="preserve">do not yet match the retained Auth users.</w:t>
       </w:r>
     </w:p>
     <w:p>
@@ -573,7 +615,22 @@
         </w:numPr>
       </w:pPr>
       <w:r>
-        <w:t xml:space="preserve">Reconnect the Vercel project to Git only after the verified private-beta code is merged into the intended production branch.</w:t>
+        <w:t xml:space="preserve">Deploy the verified</w:t>
+      </w:r>
+      <w:r>
+        <w:t xml:space="preserve"> </w:t>
+      </w:r>
+      <w:r>
+        <w:rPr>
+          <w:rStyle w:val="VerbatimChar"/>
+        </w:rPr>
+        <w:t xml:space="preserve">main</w:t>
+      </w:r>
+      <w:r>
+        <w:t xml:space="preserve"> </w:t>
+      </w:r>
+      <w:r>
+        <w:t xml:space="preserve">source to the private Vercel project. Completed through the Vercel CLI on August 25, 2026; Git remains intentionally disconnected until final owner tests pass.</w:t>
       </w:r>
     </w:p>
     <w:p>
@@ -654,7 +711,19 @@
         </w:numPr>
       </w:pPr>
       <w:r>
-        <w:t xml:space="preserve">Configure and test the invitation email so it opens</w:t>
+        <w:t xml:space="preserve">Save the Relay invitation and recovery email templates in Supabase.</w:t>
+      </w:r>
+    </w:p>
+    <w:p>
+      <w:pPr>
+        <w:pStyle w:val="Compact"/>
+        <w:numPr>
+          <w:ilvl w:val="0"/>
+          <w:numId w:val="1019"/>
+        </w:numPr>
+      </w:pPr>
+      <w:r>
+        <w:t xml:space="preserve">Send a controlled invitation and verify that it opens</w:t>
       </w:r>
       <w:r>
         <w:t xml:space="preserve"> </w:t>
@@ -686,7 +755,7 @@
         <w:pStyle w:val="Compact"/>
         <w:numPr>
           <w:ilvl w:val="0"/>
-          <w:numId w:val="1019"/>
+          <w:numId w:val="1020"/>
         </w:numPr>
       </w:pPr>
       <w:r>
@@ -698,7 +767,7 @@
         <w:pStyle w:val="Compact"/>
         <w:numPr>
           <w:ilvl w:val="0"/>
-          <w:numId w:val="1020"/>
+          <w:numId w:val="1021"/>
         </w:numPr>
       </w:pPr>
       <w:r>
@@ -710,7 +779,7 @@
         <w:pStyle w:val="Compact"/>
         <w:numPr>
           <w:ilvl w:val="0"/>
-          <w:numId w:val="1021"/>
+          <w:numId w:val="1022"/>
         </w:numPr>
       </w:pPr>
       <w:r>
@@ -722,7 +791,7 @@
         <w:pStyle w:val="Compact"/>
         <w:numPr>
           <w:ilvl w:val="0"/>
-          <w:numId w:val="1022"/>
+          <w:numId w:val="1023"/>
         </w:numPr>
       </w:pPr>
       <w:r>
@@ -734,7 +803,7 @@
         <w:pStyle w:val="Compact"/>
         <w:numPr>
           <w:ilvl w:val="0"/>
-          <w:numId w:val="1023"/>
+          <w:numId w:val="1024"/>
         </w:numPr>
       </w:pPr>
       <w:r>
@@ -1108,7 +1177,7 @@
         <w:pStyle w:val="Compact"/>
         <w:numPr>
           <w:ilvl w:val="0"/>
-          <w:numId w:val="1024"/>
+          <w:numId w:val="1025"/>
         </w:numPr>
       </w:pPr>
       <w:r>
@@ -1120,7 +1189,7 @@
         <w:pStyle w:val="Compact"/>
         <w:numPr>
           <w:ilvl w:val="0"/>
-          <w:numId w:val="1024"/>
+          <w:numId w:val="1025"/>
         </w:numPr>
       </w:pPr>
       <w:r>
@@ -1132,7 +1201,7 @@
         <w:pStyle w:val="Compact"/>
         <w:numPr>
           <w:ilvl w:val="0"/>
-          <w:numId w:val="1024"/>
+          <w:numId w:val="1025"/>
         </w:numPr>
       </w:pPr>
       <w:r>
@@ -1144,7 +1213,7 @@
         <w:pStyle w:val="Compact"/>
         <w:numPr>
           <w:ilvl w:val="0"/>
-          <w:numId w:val="1024"/>
+          <w:numId w:val="1025"/>
         </w:numPr>
       </w:pPr>
       <w:r>
@@ -1156,7 +1225,7 @@
         <w:pStyle w:val="Compact"/>
         <w:numPr>
           <w:ilvl w:val="0"/>
-          <w:numId w:val="1024"/>
+          <w:numId w:val="1025"/>
         </w:numPr>
       </w:pPr>
       <w:r>
@@ -1168,7 +1237,7 @@
         <w:pStyle w:val="Compact"/>
         <w:numPr>
           <w:ilvl w:val="0"/>
-          <w:numId w:val="1024"/>
+          <w:numId w:val="1025"/>
         </w:numPr>
       </w:pPr>
       <w:r>
@@ -1180,7 +1249,7 @@
         <w:pStyle w:val="Compact"/>
         <w:numPr>
           <w:ilvl w:val="0"/>
-          <w:numId w:val="1024"/>
+          <w:numId w:val="1025"/>
         </w:numPr>
       </w:pPr>
       <w:r>
@@ -1192,19 +1261,19 @@
         <w:pStyle w:val="Compact"/>
         <w:numPr>
           <w:ilvl w:val="0"/>
-          <w:numId w:val="1024"/>
-        </w:numPr>
-      </w:pPr>
-      <w:r>
-        <w:t xml:space="preserve">Reconnect Git and authorize the first production deployment only after every readiness and isolation test passes.</w:t>
-      </w:r>
-    </w:p>
-    <w:p>
-      <w:pPr>
-        <w:pStyle w:val="Compact"/>
-        <w:numPr>
-          <w:ilvl w:val="0"/>
-          <w:numId w:val="1024"/>
+          <w:numId w:val="1025"/>
+        </w:numPr>
+      </w:pPr>
+      <w:r>
+        <w:t xml:space="preserve">Decide whether to connect the private Vercel project to Git after final owner testing. The first production deployment was performed manually through the Vercel CLI so public-demo pushes cannot silently change the private beta.</w:t>
+      </w:r>
+    </w:p>
+    <w:p>
+      <w:pPr>
+        <w:pStyle w:val="Compact"/>
+        <w:numPr>
+          <w:ilvl w:val="0"/>
+          <w:numId w:val="1025"/>
         </w:numPr>
       </w:pPr>
       <w:r>
@@ -1302,7 +1371,7 @@
         <w:pStyle w:val="Compact"/>
         <w:numPr>
           <w:ilvl w:val="0"/>
-          <w:numId w:val="1025"/>
+          <w:numId w:val="1026"/>
         </w:numPr>
       </w:pPr>
       <w:r>
@@ -1314,7 +1383,7 @@
         <w:pStyle w:val="Compact"/>
         <w:numPr>
           <w:ilvl w:val="0"/>
-          <w:numId w:val="1026"/>
+          <w:numId w:val="1027"/>
         </w:numPr>
       </w:pPr>
       <w:r>
@@ -1326,7 +1395,7 @@
         <w:pStyle w:val="Compact"/>
         <w:numPr>
           <w:ilvl w:val="0"/>
-          <w:numId w:val="1027"/>
+          <w:numId w:val="1028"/>
         </w:numPr>
       </w:pPr>
       <w:r>
@@ -1338,7 +1407,7 @@
         <w:pStyle w:val="Compact"/>
         <w:numPr>
           <w:ilvl w:val="0"/>
-          <w:numId w:val="1028"/>
+          <w:numId w:val="1029"/>
         </w:numPr>
       </w:pPr>
       <w:r>
@@ -1368,7 +1437,7 @@
         <w:pStyle w:val="Compact"/>
         <w:numPr>
           <w:ilvl w:val="0"/>
-          <w:numId w:val="1029"/>
+          <w:numId w:val="1030"/>
         </w:numPr>
       </w:pPr>
       <w:r>
@@ -1380,7 +1449,7 @@
         <w:pStyle w:val="Compact"/>
         <w:numPr>
           <w:ilvl w:val="0"/>
-          <w:numId w:val="1029"/>
+          <w:numId w:val="1030"/>
         </w:numPr>
       </w:pPr>
       <w:r>
@@ -1405,7 +1474,7 @@
         <w:pStyle w:val="Compact"/>
         <w:numPr>
           <w:ilvl w:val="0"/>
-          <w:numId w:val="1029"/>
+          <w:numId w:val="1030"/>
         </w:numPr>
       </w:pPr>
       <w:r>
@@ -1430,7 +1499,7 @@
         <w:pStyle w:val="Compact"/>
         <w:numPr>
           <w:ilvl w:val="0"/>
-          <w:numId w:val="1029"/>
+          <w:numId w:val="1030"/>
         </w:numPr>
       </w:pPr>
       <w:r>
@@ -1442,7 +1511,7 @@
         <w:pStyle w:val="Compact"/>
         <w:numPr>
           <w:ilvl w:val="0"/>
-          <w:numId w:val="1029"/>
+          <w:numId w:val="1030"/>
         </w:numPr>
       </w:pPr>
       <w:r>
@@ -1496,7 +1565,7 @@
         <w:pStyle w:val="Compact"/>
         <w:numPr>
           <w:ilvl w:val="0"/>
-          <w:numId w:val="1030"/>
+          <w:numId w:val="1031"/>
         </w:numPr>
       </w:pPr>
       <w:r>
@@ -1508,7 +1577,7 @@
         <w:pStyle w:val="Compact"/>
         <w:numPr>
           <w:ilvl w:val="0"/>
-          <w:numId w:val="1030"/>
+          <w:numId w:val="1031"/>
         </w:numPr>
       </w:pPr>
       <w:r>
@@ -1520,7 +1589,7 @@
         <w:pStyle w:val="Compact"/>
         <w:numPr>
           <w:ilvl w:val="0"/>
-          <w:numId w:val="1030"/>
+          <w:numId w:val="1031"/>
         </w:numPr>
       </w:pPr>
       <w:r>
@@ -1532,7 +1601,7 @@
         <w:pStyle w:val="Compact"/>
         <w:numPr>
           <w:ilvl w:val="0"/>
-          <w:numId w:val="1030"/>
+          <w:numId w:val="1031"/>
         </w:numPr>
       </w:pPr>
       <w:r>
@@ -1544,7 +1613,7 @@
         <w:pStyle w:val="Compact"/>
         <w:numPr>
           <w:ilvl w:val="0"/>
-          <w:numId w:val="1030"/>
+          <w:numId w:val="1031"/>
         </w:numPr>
       </w:pPr>
       <w:r>
@@ -1574,7 +1643,7 @@
         <w:pStyle w:val="Compact"/>
         <w:numPr>
           <w:ilvl w:val="0"/>
-          <w:numId w:val="1031"/>
+          <w:numId w:val="1032"/>
         </w:numPr>
       </w:pPr>
       <w:r>
@@ -1586,7 +1655,7 @@
         <w:pStyle w:val="Compact"/>
         <w:numPr>
           <w:ilvl w:val="0"/>
-          <w:numId w:val="1032"/>
+          <w:numId w:val="1033"/>
         </w:numPr>
       </w:pPr>
       <w:r>
@@ -1598,7 +1667,7 @@
         <w:pStyle w:val="Compact"/>
         <w:numPr>
           <w:ilvl w:val="0"/>
-          <w:numId w:val="1033"/>
+          <w:numId w:val="1034"/>
         </w:numPr>
       </w:pPr>
       <w:r>
@@ -1610,7 +1679,7 @@
         <w:pStyle w:val="Compact"/>
         <w:numPr>
           <w:ilvl w:val="0"/>
-          <w:numId w:val="1034"/>
+          <w:numId w:val="1035"/>
         </w:numPr>
       </w:pPr>
       <w:r>
@@ -1622,7 +1691,7 @@
         <w:pStyle w:val="Compact"/>
         <w:numPr>
           <w:ilvl w:val="0"/>
-          <w:numId w:val="1035"/>
+          <w:numId w:val="1036"/>
         </w:numPr>
       </w:pPr>
       <w:r>
@@ -1634,7 +1703,7 @@
         <w:pStyle w:val="Compact"/>
         <w:numPr>
           <w:ilvl w:val="0"/>
-          <w:numId w:val="1036"/>
+          <w:numId w:val="1037"/>
         </w:numPr>
       </w:pPr>
       <w:r>
@@ -1646,7 +1715,7 @@
         <w:pStyle w:val="Compact"/>
         <w:numPr>
           <w:ilvl w:val="0"/>
-          <w:numId w:val="1037"/>
+          <w:numId w:val="1038"/>
         </w:numPr>
       </w:pPr>
       <w:r>
@@ -1658,7 +1727,7 @@
         <w:pStyle w:val="Compact"/>
         <w:numPr>
           <w:ilvl w:val="0"/>
-          <w:numId w:val="1038"/>
+          <w:numId w:val="1039"/>
         </w:numPr>
       </w:pPr>
       <w:r>
@@ -1731,7 +1800,7 @@
         <w:pStyle w:val="Compact"/>
         <w:numPr>
           <w:ilvl w:val="0"/>
-          <w:numId w:val="1039"/>
+          <w:numId w:val="1040"/>
         </w:numPr>
       </w:pPr>
       <w:r>
@@ -1743,7 +1812,7 @@
         <w:pStyle w:val="Compact"/>
         <w:numPr>
           <w:ilvl w:val="0"/>
-          <w:numId w:val="1040"/>
+          <w:numId w:val="1041"/>
         </w:numPr>
       </w:pPr>
       <w:r>
@@ -1755,7 +1824,7 @@
         <w:pStyle w:val="Compact"/>
         <w:numPr>
           <w:ilvl w:val="0"/>
-          <w:numId w:val="1041"/>
+          <w:numId w:val="1042"/>
         </w:numPr>
       </w:pPr>
       <w:r>
@@ -1767,7 +1836,7 @@
         <w:pStyle w:val="Compact"/>
         <w:numPr>
           <w:ilvl w:val="0"/>
-          <w:numId w:val="1042"/>
+          <w:numId w:val="1043"/>
         </w:numPr>
       </w:pPr>
       <w:r>
@@ -1779,7 +1848,7 @@
         <w:pStyle w:val="Compact"/>
         <w:numPr>
           <w:ilvl w:val="0"/>
-          <w:numId w:val="1043"/>
+          <w:numId w:val="1044"/>
         </w:numPr>
       </w:pPr>
       <w:r>
@@ -1809,7 +1878,7 @@
         <w:pStyle w:val="Compact"/>
         <w:numPr>
           <w:ilvl w:val="0"/>
-          <w:numId w:val="1044"/>
+          <w:numId w:val="1045"/>
         </w:numPr>
       </w:pPr>
       <w:r>
@@ -1821,7 +1890,7 @@
         <w:pStyle w:val="Compact"/>
         <w:numPr>
           <w:ilvl w:val="0"/>
-          <w:numId w:val="1044"/>
+          <w:numId w:val="1045"/>
         </w:numPr>
       </w:pPr>
       <w:r>
@@ -1833,7 +1902,7 @@
         <w:pStyle w:val="Compact"/>
         <w:numPr>
           <w:ilvl w:val="0"/>
-          <w:numId w:val="1044"/>
+          <w:numId w:val="1045"/>
         </w:numPr>
       </w:pPr>
       <w:r>
@@ -1845,7 +1914,7 @@
         <w:pStyle w:val="Compact"/>
         <w:numPr>
           <w:ilvl w:val="0"/>
-          <w:numId w:val="1044"/>
+          <w:numId w:val="1045"/>
         </w:numPr>
       </w:pPr>
       <w:r>
@@ -1857,7 +1926,7 @@
         <w:pStyle w:val="Compact"/>
         <w:numPr>
           <w:ilvl w:val="0"/>
-          <w:numId w:val="1044"/>
+          <w:numId w:val="1045"/>
         </w:numPr>
       </w:pPr>
       <w:r>
@@ -1869,7 +1938,7 @@
         <w:pStyle w:val="Compact"/>
         <w:numPr>
           <w:ilvl w:val="0"/>
-          <w:numId w:val="1044"/>
+          <w:numId w:val="1045"/>
         </w:numPr>
       </w:pPr>
       <w:r>
@@ -1881,7 +1950,7 @@
         <w:pStyle w:val="Compact"/>
         <w:numPr>
           <w:ilvl w:val="0"/>
-          <w:numId w:val="1044"/>
+          <w:numId w:val="1045"/>
         </w:numPr>
       </w:pPr>
       <w:r>
@@ -1893,7 +1962,7 @@
         <w:pStyle w:val="Compact"/>
         <w:numPr>
           <w:ilvl w:val="0"/>
-          <w:numId w:val="1044"/>
+          <w:numId w:val="1045"/>
         </w:numPr>
       </w:pPr>
       <w:r>
@@ -2168,7 +2237,7 @@
         <w:pStyle w:val="Compact"/>
         <w:numPr>
           <w:ilvl w:val="0"/>
-          <w:numId w:val="1045"/>
+          <w:numId w:val="1046"/>
         </w:numPr>
       </w:pPr>
       <w:r>
@@ -2210,7 +2279,7 @@
         <w:pStyle w:val="Compact"/>
         <w:numPr>
           <w:ilvl w:val="0"/>
-          <w:numId w:val="1045"/>
+          <w:numId w:val="1046"/>
         </w:numPr>
       </w:pPr>
       <w:r>
@@ -2222,7 +2291,7 @@
         <w:pStyle w:val="Compact"/>
         <w:numPr>
           <w:ilvl w:val="0"/>
-          <w:numId w:val="1045"/>
+          <w:numId w:val="1046"/>
         </w:numPr>
       </w:pPr>
       <w:r>
@@ -2234,7 +2303,7 @@
         <w:pStyle w:val="Compact"/>
         <w:numPr>
           <w:ilvl w:val="0"/>
-          <w:numId w:val="1045"/>
+          <w:numId w:val="1046"/>
         </w:numPr>
       </w:pPr>
       <w:r>
@@ -2246,7 +2315,7 @@
         <w:pStyle w:val="Compact"/>
         <w:numPr>
           <w:ilvl w:val="0"/>
-          <w:numId w:val="1045"/>
+          <w:numId w:val="1046"/>
         </w:numPr>
       </w:pPr>
       <w:r>
@@ -2268,7 +2337,7 @@
         <w:pStyle w:val="Compact"/>
         <w:numPr>
           <w:ilvl w:val="0"/>
-          <w:numId w:val="1046"/>
+          <w:numId w:val="1047"/>
         </w:numPr>
       </w:pPr>
       <w:r>
@@ -2283,7 +2352,7 @@
         <w:pStyle w:val="Compact"/>
         <w:numPr>
           <w:ilvl w:val="0"/>
-          <w:numId w:val="1046"/>
+          <w:numId w:val="1047"/>
         </w:numPr>
       </w:pPr>
       <w:r>
@@ -2298,7 +2367,7 @@
         <w:pStyle w:val="Compact"/>
         <w:numPr>
           <w:ilvl w:val="0"/>
-          <w:numId w:val="1046"/>
+          <w:numId w:val="1047"/>
         </w:numPr>
       </w:pPr>
       <w:r>
@@ -2313,7 +2382,7 @@
         <w:pStyle w:val="Compact"/>
         <w:numPr>
           <w:ilvl w:val="0"/>
-          <w:numId w:val="1046"/>
+          <w:numId w:val="1047"/>
         </w:numPr>
       </w:pPr>
       <w:r>
@@ -2328,7 +2397,7 @@
         <w:pStyle w:val="Compact"/>
         <w:numPr>
           <w:ilvl w:val="0"/>
-          <w:numId w:val="1046"/>
+          <w:numId w:val="1047"/>
         </w:numPr>
       </w:pPr>
       <w:r>
@@ -2343,7 +2412,7 @@
         <w:pStyle w:val="Compact"/>
         <w:numPr>
           <w:ilvl w:val="0"/>
-          <w:numId w:val="1046"/>
+          <w:numId w:val="1047"/>
         </w:numPr>
       </w:pPr>
       <w:r>
@@ -2358,7 +2427,7 @@
         <w:pStyle w:val="Compact"/>
         <w:numPr>
           <w:ilvl w:val="0"/>
-          <w:numId w:val="1046"/>
+          <w:numId w:val="1047"/>
         </w:numPr>
       </w:pPr>
       <w:r>
@@ -2373,7 +2442,7 @@
         <w:pStyle w:val="Compact"/>
         <w:numPr>
           <w:ilvl w:val="0"/>
-          <w:numId w:val="1046"/>
+          <w:numId w:val="1047"/>
         </w:numPr>
       </w:pPr>
       <w:r>
@@ -2881,7 +2950,7 @@
     <w:abstractNumId w:val="993"/>
   </w:num>
   <w:num w:numId="1015">
-    <w:abstractNumId w:val="992"/>
+    <w:abstractNumId w:val="993"/>
   </w:num>
   <w:num w:numId="1016">
     <w:abstractNumId w:val="993"/>
@@ -2890,10 +2959,10 @@
     <w:abstractNumId w:val="993"/>
   </w:num>
   <w:num w:numId="1018">
+    <w:abstractNumId w:val="993"/>
+  </w:num>
+  <w:num w:numId="1019">
     <w:abstractNumId w:val="992"/>
-  </w:num>
-  <w:num w:numId="1019">
-    <w:abstractNumId w:val="993"/>
   </w:num>
   <w:num w:numId="1020">
     <w:abstractNumId w:val="993"/>
@@ -2902,16 +2971,16 @@
     <w:abstractNumId w:val="993"/>
   </w:num>
   <w:num w:numId="1022">
-    <w:abstractNumId w:val="992"/>
+    <w:abstractNumId w:val="993"/>
   </w:num>
   <w:num w:numId="1023">
     <w:abstractNumId w:val="992"/>
   </w:num>
   <w:num w:numId="1024">
+    <w:abstractNumId w:val="992"/>
+  </w:num>
+  <w:num w:numId="1025">
     <w:abstractNumId w:val="991"/>
-  </w:num>
-  <w:num w:numId="1025">
-    <w:abstractNumId w:val="992"/>
   </w:num>
   <w:num w:numId="1026">
     <w:abstractNumId w:val="992"/>
@@ -2923,34 +2992,7 @@
     <w:abstractNumId w:val="992"/>
   </w:num>
   <w:num w:numId="1029">
-    <w:abstractNumId w:val="99411"/>
-    <w:lvlOverride w:ilvl="0">
-      <w:startOverride w:val="1"/>
-    </w:lvlOverride>
-    <w:lvlOverride w:ilvl="1">
-      <w:startOverride w:val="1"/>
-    </w:lvlOverride>
-    <w:lvlOverride w:ilvl="2">
-      <w:startOverride w:val="1"/>
-    </w:lvlOverride>
-    <w:lvlOverride w:ilvl="3">
-      <w:startOverride w:val="1"/>
-    </w:lvlOverride>
-    <w:lvlOverride w:ilvl="4">
-      <w:startOverride w:val="1"/>
-    </w:lvlOverride>
-    <w:lvlOverride w:ilvl="5">
-      <w:startOverride w:val="1"/>
-    </w:lvlOverride>
-    <w:lvlOverride w:ilvl="6">
-      <w:startOverride w:val="1"/>
-    </w:lvlOverride>
-    <w:lvlOverride w:ilvl="7">
-      <w:startOverride w:val="1"/>
-    </w:lvlOverride>
-    <w:lvlOverride w:ilvl="8">
-      <w:startOverride w:val="1"/>
-    </w:lvlOverride>
+    <w:abstractNumId w:val="992"/>
   </w:num>
   <w:num w:numId="1030">
     <w:abstractNumId w:val="99411"/>
@@ -2983,45 +3025,6 @@
     </w:lvlOverride>
   </w:num>
   <w:num w:numId="1031">
-    <w:abstractNumId w:val="992"/>
-  </w:num>
-  <w:num w:numId="1032">
-    <w:abstractNumId w:val="992"/>
-  </w:num>
-  <w:num w:numId="1033">
-    <w:abstractNumId w:val="992"/>
-  </w:num>
-  <w:num w:numId="1034">
-    <w:abstractNumId w:val="992"/>
-  </w:num>
-  <w:num w:numId="1035">
-    <w:abstractNumId w:val="992"/>
-  </w:num>
-  <w:num w:numId="1036">
-    <w:abstractNumId w:val="992"/>
-  </w:num>
-  <w:num w:numId="1037">
-    <w:abstractNumId w:val="992"/>
-  </w:num>
-  <w:num w:numId="1038">
-    <w:abstractNumId w:val="992"/>
-  </w:num>
-  <w:num w:numId="1039">
-    <w:abstractNumId w:val="992"/>
-  </w:num>
-  <w:num w:numId="1040">
-    <w:abstractNumId w:val="992"/>
-  </w:num>
-  <w:num w:numId="1041">
-    <w:abstractNumId w:val="992"/>
-  </w:num>
-  <w:num w:numId="1042">
-    <w:abstractNumId w:val="992"/>
-  </w:num>
-  <w:num w:numId="1043">
-    <w:abstractNumId w:val="992"/>
-  </w:num>
-  <w:num w:numId="1044">
     <w:abstractNumId w:val="99411"/>
     <w:lvlOverride w:ilvl="0">
       <w:startOverride w:val="1"/>
@@ -3051,10 +3054,79 @@
       <w:startOverride w:val="1"/>
     </w:lvlOverride>
   </w:num>
+  <w:num w:numId="1032">
+    <w:abstractNumId w:val="992"/>
+  </w:num>
+  <w:num w:numId="1033">
+    <w:abstractNumId w:val="992"/>
+  </w:num>
+  <w:num w:numId="1034">
+    <w:abstractNumId w:val="992"/>
+  </w:num>
+  <w:num w:numId="1035">
+    <w:abstractNumId w:val="992"/>
+  </w:num>
+  <w:num w:numId="1036">
+    <w:abstractNumId w:val="992"/>
+  </w:num>
+  <w:num w:numId="1037">
+    <w:abstractNumId w:val="992"/>
+  </w:num>
+  <w:num w:numId="1038">
+    <w:abstractNumId w:val="992"/>
+  </w:num>
+  <w:num w:numId="1039">
+    <w:abstractNumId w:val="992"/>
+  </w:num>
+  <w:num w:numId="1040">
+    <w:abstractNumId w:val="992"/>
+  </w:num>
+  <w:num w:numId="1041">
+    <w:abstractNumId w:val="992"/>
+  </w:num>
+  <w:num w:numId="1042">
+    <w:abstractNumId w:val="992"/>
+  </w:num>
+  <w:num w:numId="1043">
+    <w:abstractNumId w:val="992"/>
+  </w:num>
+  <w:num w:numId="1044">
+    <w:abstractNumId w:val="992"/>
+  </w:num>
   <w:num w:numId="1045">
+    <w:abstractNumId w:val="99411"/>
+    <w:lvlOverride w:ilvl="0">
+      <w:startOverride w:val="1"/>
+    </w:lvlOverride>
+    <w:lvlOverride w:ilvl="1">
+      <w:startOverride w:val="1"/>
+    </w:lvlOverride>
+    <w:lvlOverride w:ilvl="2">
+      <w:startOverride w:val="1"/>
+    </w:lvlOverride>
+    <w:lvlOverride w:ilvl="3">
+      <w:startOverride w:val="1"/>
+    </w:lvlOverride>
+    <w:lvlOverride w:ilvl="4">
+      <w:startOverride w:val="1"/>
+    </w:lvlOverride>
+    <w:lvlOverride w:ilvl="5">
+      <w:startOverride w:val="1"/>
+    </w:lvlOverride>
+    <w:lvlOverride w:ilvl="6">
+      <w:startOverride w:val="1"/>
+    </w:lvlOverride>
+    <w:lvlOverride w:ilvl="7">
+      <w:startOverride w:val="1"/>
+    </w:lvlOverride>
+    <w:lvlOverride w:ilvl="8">
+      <w:startOverride w:val="1"/>
+    </w:lvlOverride>
+  </w:num>
+  <w:num w:numId="1046">
     <w:abstractNumId w:val="991"/>
   </w:num>
-  <w:num w:numId="1046">
+  <w:num w:numId="1047">
     <w:abstractNumId w:val="991"/>
   </w:num>
 </w:numbering>

</xml_diff>

<commit_message>
docs: record private beta isolation pass
Capture the successful cross-workspace database and Storage checks so external access remains gated only by the invitation flow and billing review.
</commit_message>
<xml_diff>
--- a/docs/Relay_Private_Beta_Tester_Access_Runbook.docx
+++ b/docs/Relay_Private_Beta_Tester_Access_Runbook.docx
@@ -126,7 +126,7 @@
         <w:pStyle w:val="BodyText"/>
       </w:pPr>
       <w:r>
-        <w:t xml:space="preserve">The configured Supabase backend passed its restored-backup rehearsal and live migration on August 24, 2026. The unrelated Auth user was removed, the two retained accounts are owner-controlled, both migrations applied successfully, and the fail-closed security audit passed. Public signup and anonymous sign-ins are disabled, email confirmation remains enabled, Relay Auth URLs are configured, and the Relay invitation/recovery templates are saved. The live login redirect and branding smoke test passed on August 25. Do not invite external testers until the two local test-account credentials are mapped to the retained users, the isolation test passes, the invitation/recovery flow is exercised, and billing is confirmed.</w:t>
+        <w:t xml:space="preserve">The configured Supabase backend passed its restored-backup rehearsal and live migration on August 24, 2026. The unrelated Auth user was removed, the two retained accounts are owner-controlled, both migrations applied successfully, and the fail-closed security audit passed. Public signup and anonymous sign-ins are disabled, email confirmation remains enabled, Relay Auth URLs are configured, and the Relay invitation/recovery templates are saved. The live login redirect and branding smoke test passed on August 25. The two-account runtime test also passed database and private Storage isolation, and its cleanup audit found no temporary rows or files. Do not invite external testers until the invitation/recovery flow is exercised and Supabase billing is confirmed.</w:t>
       </w:r>
     </w:p>
     <w:p>
@@ -396,37 +396,7 @@
         </w:numPr>
       </w:pPr>
       <w:r>
-        <w:t xml:space="preserve">Test two unrelated invited accounts and confirm neither can read, change, delete, subscribe to, download, or guess the other account’s records and files. Blocked on August 25 because the two</w:t>
-      </w:r>
-      <w:r>
-        <w:t xml:space="preserve"> </w:t>
-      </w:r>
-      <w:r>
-        <w:rPr>
-          <w:rStyle w:val="VerbatimChar"/>
-        </w:rPr>
-        <w:t xml:space="preserve">TEST_USER_*</w:t>
-      </w:r>
-      <w:r>
-        <w:t xml:space="preserve"> </w:t>
-      </w:r>
-      <w:r>
-        <w:t xml:space="preserve">email/password pairs in</w:t>
-      </w:r>
-      <w:r>
-        <w:t xml:space="preserve"> </w:t>
-      </w:r>
-      <w:r>
-        <w:rPr>
-          <w:rStyle w:val="VerbatimChar"/>
-        </w:rPr>
-        <w:t xml:space="preserve">.env.private-beta.local</w:t>
-      </w:r>
-      <w:r>
-        <w:t xml:space="preserve"> </w:t>
-      </w:r>
-      <w:r>
-        <w:t xml:space="preserve">do not yet match the retained Auth users.</w:t>
+        <w:t xml:space="preserve">Test two unrelated controlled accounts and confirm cross-workspace project reads, inserts, updates, and private Storage downloads are denied. Passed August 25, 2026; cleanup verification found zero temporary project rows and zero remaining test folders.</w:t>
       </w:r>
     </w:p>
     <w:p>
@@ -2926,7 +2896,7 @@
     <w:abstractNumId w:val="993"/>
   </w:num>
   <w:num w:numId="1007">
-    <w:abstractNumId w:val="992"/>
+    <w:abstractNumId w:val="993"/>
   </w:num>
   <w:num w:numId="1008">
     <w:abstractNumId w:val="992"/>

</xml_diff>